<commit_message>
started making updates to docker files
</commit_message>
<xml_diff>
--- a/lab_sreenshots.docx
+++ b/lab_sreenshots.docx
@@ -4,13 +4,21 @@
   <w:body>
     <w:p>
       <w:r>
+        <w:t xml:space="preserve">Repo: </w:t>
+      </w:r>
+      <w:r>
+        <w:t>https://github.com/edgyvelociraptr/django-ci-lab/tree/main</w:t>
+      </w:r>
+    </w:p>
+    <w:p>
+      <w:r>
         <w:rPr>
           <w:noProof/>
         </w:rPr>
         <w:drawing>
-          <wp:inline distT="0" distB="0" distL="0" distR="0" wp14:anchorId="124E945C" wp14:editId="36D4ED66">
-            <wp:extent cx="5943600" cy="6686550"/>
-            <wp:effectExtent l="0" t="0" r="0" b="0"/>
+          <wp:inline distT="0" distB="0" distL="0" distR="0" wp14:anchorId="124E945C" wp14:editId="0AA5C449">
+            <wp:extent cx="4183380" cy="4706302"/>
+            <wp:effectExtent l="0" t="0" r="7620" b="0"/>
             <wp:docPr id="216671801" name="Picture 1" descr="A Docker image build process is being executed, creating a new image based on Python 3.9-slim, copying a requirements.txt file, installing dependencies, and copying the rest of the application files into the image.&#10;&#10;AI-generated content may be incorrect."/>
             <wp:cNvGraphicFramePr>
               <a:graphicFrameLocks xmlns:a="http://schemas.openxmlformats.org/drawingml/2006/main" noChangeAspect="1"/>
@@ -37,7 +45,7 @@
                   <pic:spPr>
                     <a:xfrm>
                       <a:off x="0" y="0"/>
-                      <a:ext cx="5943600" cy="6686550"/>
+                      <a:ext cx="4192222" cy="4716250"/>
                     </a:xfrm>
                     <a:prstGeom prst="rect">
                       <a:avLst/>
@@ -53,9 +61,8 @@
         <w:rPr>
           <w:noProof/>
         </w:rPr>
-        <w:lastRenderedPageBreak/>
         <w:drawing>
-          <wp:inline distT="0" distB="0" distL="0" distR="0" wp14:anchorId="4F99DB3C" wp14:editId="4F8A761A">
+          <wp:inline distT="0" distB="0" distL="0" distR="0" wp14:anchorId="4F99DB3C" wp14:editId="1467D035">
             <wp:extent cx="5943600" cy="3138170"/>
             <wp:effectExtent l="0" t="0" r="0" b="5080"/>
             <wp:docPr id="691087268" name="Picture 2" descr="The image depicts a user navigating through a series of error messages and code snippets in a Docker environment, likely related to setting up a Django application for testing REST API.&#10;&#10;AI-generated content may be incorrect."/>
@@ -100,6 +107,7 @@
         <w:rPr>
           <w:noProof/>
         </w:rPr>
+        <w:lastRenderedPageBreak/>
         <w:drawing>
           <wp:inline distT="0" distB="0" distL="0" distR="0" wp14:anchorId="0F6E069A" wp14:editId="3F2033F6">
             <wp:extent cx="5943600" cy="3418840"/>

</xml_diff>